<commit_message>
feat: v0.4.0 전체 업데이트
- Samsung Health 스타일 상단 네비게이션(TopNav) 전환
- 로드맵을 시뮬레이터 내 탭으로 통합 (14->13페이지)
- 모니터링 에이전트 시스템 (코어+4서포트+CLAUDE.md 연계)
- SVG 게이지 (Recharts 제거) + WCAG AA 텍스트 대비
- 로그인 보안 강화 (Authorization 헤더, sessionStorage, 게스트 제한)
- Tailwind Samsung Blue 테마 + 다크/라이트 모드 색상 대비 개선
- 버그 수정 19건 + 품질 개선 5건
- v7 docx + report.html 업데이트
- Railway 배포용 .env.production 설정

Co-Authored-By: Claude Opus 4.6 (1M context) <noreply@anthropic.com>
</commit_message>
<xml_diff>
--- a/lifesync-ai/docs/architecture-report-v7.docx
+++ b/lifesync-ai/docs/architecture-report-v7.docx
@@ -46,7 +46,7 @@
           <w:sz w:val="16"/>
           <w:szCs w:val="16"/>
         </w:rPr>
-        <w:t xml:space="preserve">4 Domains | 14 Pages | 35+ API | 6 Team Members | 19 Bug Fixes</w:t>
+        <w:t xml:space="preserve">4 Domains | 13 Pages | 35+ API | 6 Team Members | 19 Bug Fixes | Top Nav</w:t>
       </w:r>
     </w:p>
     <w:p>
@@ -2218,7 +2218,20 @@
           <w:sz w:val="28"/>
           <w:szCs w:val="28"/>
         </w:rPr>
-        <w:t xml:space="preserve">4. 프론트엔드 14개 페이지</w:t>
+        <w:t xml:space="preserve">4. 프론트엔드 13개 페이지</w:t>
+      </w:r>
+    </w:p>
+    <w:p>
+      <w:pPr>
+        <w:spacing w:after="80"/>
+      </w:pPr>
+      <w:r>
+        <w:rPr>
+          <w:rFonts w:ascii="Arial" w:cs="Arial" w:eastAsia="Arial" w:hAnsi="Arial"/>
+          <w:sz w:val="17"/>
+          <w:szCs w:val="17"/>
+        </w:rPr>
+        <w:t xml:space="preserve">Samsung Health 스타일 상단 네비게이션(TopNav) + 다크/라이트 자동 전환. 로드맵은 시뮬레이터 내 탭으로 통합.</w:t>
       </w:r>
     </w:p>
     <w:tbl>
@@ -2234,9 +2247,9 @@
         </w:tblBorders>
       </w:tblPr>
       <w:tblGrid>
-        <w:gridCol w:w="1400"/>
         <w:gridCol w:w="1600"/>
-        <w:gridCol w:w="6360"/>
+        <w:gridCol w:w="1800"/>
+        <w:gridCol w:w="5960"/>
       </w:tblGrid>
       <w:tr>
         <w:tc>
@@ -2411,7 +2424,7 @@
                 <w:sz w:val="17"/>
                 <w:szCs w:val="17"/>
               </w:rPr>
-              <w:t xml:space="preserve">랜딩 페이지</w:t>
+              <w:t xml:space="preserve">풀스크린 히어로 + 4도메인 이미지 카드</w:t>
             </w:r>
           </w:p>
         </w:tc>
@@ -2494,7 +2507,7 @@
                 <w:sz w:val="17"/>
                 <w:szCs w:val="17"/>
               </w:rPr>
-              <w:t xml:space="preserve">카카오 OAuth + 게스트</w:t>
+              <w:t xml:space="preserve">카카오 OAuth + 게스트(읽기전용)</w:t>
             </w:r>
           </w:p>
         </w:tc>
@@ -2660,7 +2673,7 @@
                 <w:sz w:val="17"/>
                 <w:szCs w:val="17"/>
               </w:rPr>
-              <w:t xml:space="preserve">Samsung Health 링차트 + 3탭</w:t>
+              <w:t xml:space="preserve">Samsung Health 링차트 + 솔루션/인사이트/코칭 3탭</w:t>
             </w:r>
           </w:p>
         </w:tc>
@@ -2743,7 +2756,7 @@
                 <w:sz w:val="17"/>
                 <w:szCs w:val="17"/>
               </w:rPr>
-              <w:t xml:space="preserve">CLIP+YOLO -&gt; Top-5</w:t>
+              <w:t xml:space="preserve">CLIP+YOLO -&gt; Top-5 추천</w:t>
             </w:r>
           </w:p>
         </w:tc>
@@ -2772,61 +2785,61 @@
                 <w:sz w:val="17"/>
                 <w:szCs w:val="17"/>
               </w:rPr>
-              <w:t xml:space="preserve">로드맵</w:t>
-            </w:r>
-          </w:p>
-        </w:tc>
-        <w:tc>
-          <w:tcPr>
-            <w:tcW w:type="auto" w:w="0"/>
-            <w:tcBorders>
-              <w:top w:val="single" w:color="CCCCCC" w:sz="1"/>
-              <w:left w:val="single" w:color="CCCCCC" w:sz="1"/>
-              <w:bottom w:val="single" w:color="CCCCCC" w:sz="1"/>
-              <w:right w:val="single" w:color="CCCCCC" w:sz="1"/>
-            </w:tcBorders>
-            <w:tcMar>
-              <w:top w:type="dxa" w:w="45"/>
-              <w:left w:type="dxa" w:w="70"/>
-              <w:bottom w:type="dxa" w:w="45"/>
-              <w:right w:type="dxa" w:w="70"/>
-            </w:tcMar>
-          </w:tcPr>
-          <w:p>
-            <w:r>
-              <w:rPr>
-                <w:rFonts w:ascii="Arial" w:cs="Arial" w:eastAsia="Arial" w:hAnsi="Arial"/>
-                <w:sz w:val="17"/>
-                <w:szCs w:val="17"/>
-              </w:rPr>
-              <w:t xml:space="preserve">/roadmap</w:t>
-            </w:r>
-          </w:p>
-        </w:tc>
-        <w:tc>
-          <w:tcPr>
-            <w:tcW w:type="auto" w:w="0"/>
-            <w:tcBorders>
-              <w:top w:val="single" w:color="CCCCCC" w:sz="1"/>
-              <w:left w:val="single" w:color="CCCCCC" w:sz="1"/>
-              <w:bottom w:val="single" w:color="CCCCCC" w:sz="1"/>
-              <w:right w:val="single" w:color="CCCCCC" w:sz="1"/>
-            </w:tcBorders>
-            <w:tcMar>
-              <w:top w:type="dxa" w:w="45"/>
-              <w:left w:type="dxa" w:w="70"/>
-              <w:bottom w:type="dxa" w:w="45"/>
-              <w:right w:type="dxa" w:w="70"/>
-            </w:tcMar>
-          </w:tcPr>
-          <w:p>
-            <w:r>
-              <w:rPr>
-                <w:rFonts w:ascii="Arial" w:cs="Arial" w:eastAsia="Arial" w:hAnsi="Arial"/>
-                <w:sz w:val="17"/>
-                <w:szCs w:val="17"/>
-              </w:rPr>
-              <w:t xml:space="preserve">12주 타임라인</w:t>
+              <w:t xml:space="preserve">시뮬레이터</w:t>
+            </w:r>
+          </w:p>
+        </w:tc>
+        <w:tc>
+          <w:tcPr>
+            <w:tcW w:type="auto" w:w="0"/>
+            <w:tcBorders>
+              <w:top w:val="single" w:color="CCCCCC" w:sz="1"/>
+              <w:left w:val="single" w:color="CCCCCC" w:sz="1"/>
+              <w:bottom w:val="single" w:color="CCCCCC" w:sz="1"/>
+              <w:right w:val="single" w:color="CCCCCC" w:sz="1"/>
+            </w:tcBorders>
+            <w:tcMar>
+              <w:top w:type="dxa" w:w="45"/>
+              <w:left w:type="dxa" w:w="70"/>
+              <w:bottom w:type="dxa" w:w="45"/>
+              <w:right w:type="dxa" w:w="70"/>
+            </w:tcMar>
+          </w:tcPr>
+          <w:p>
+            <w:r>
+              <w:rPr>
+                <w:rFonts w:ascii="Arial" w:cs="Arial" w:eastAsia="Arial" w:hAnsi="Arial"/>
+                <w:sz w:val="17"/>
+                <w:szCs w:val="17"/>
+              </w:rPr>
+              <w:t xml:space="preserve">/simulator</w:t>
+            </w:r>
+          </w:p>
+        </w:tc>
+        <w:tc>
+          <w:tcPr>
+            <w:tcW w:type="auto" w:w="0"/>
+            <w:tcBorders>
+              <w:top w:val="single" w:color="CCCCCC" w:sz="1"/>
+              <w:left w:val="single" w:color="CCCCCC" w:sz="1"/>
+              <w:bottom w:val="single" w:color="CCCCCC" w:sz="1"/>
+              <w:right w:val="single" w:color="CCCCCC" w:sz="1"/>
+            </w:tcBorders>
+            <w:tcMar>
+              <w:top w:type="dxa" w:w="45"/>
+              <w:left w:type="dxa" w:w="70"/>
+              <w:bottom w:type="dxa" w:w="45"/>
+              <w:right w:type="dxa" w:w="70"/>
+            </w:tcMar>
+          </w:tcPr>
+          <w:p>
+            <w:r>
+              <w:rPr>
+                <w:rFonts w:ascii="Arial" w:cs="Arial" w:eastAsia="Arial" w:hAnsi="Arial"/>
+                <w:sz w:val="17"/>
+                <w:szCs w:val="17"/>
+              </w:rPr>
+              <w:t xml:space="preserve">PPO RL 12주 + 12주 로드맵 탭</w:t>
             </w:r>
           </w:p>
         </w:tc>
@@ -2855,61 +2868,61 @@
                 <w:sz w:val="17"/>
                 <w:szCs w:val="17"/>
               </w:rPr>
-              <w:t xml:space="preserve">시뮬레이터</w:t>
-            </w:r>
-          </w:p>
-        </w:tc>
-        <w:tc>
-          <w:tcPr>
-            <w:tcW w:type="auto" w:w="0"/>
-            <w:tcBorders>
-              <w:top w:val="single" w:color="CCCCCC" w:sz="1"/>
-              <w:left w:val="single" w:color="CCCCCC" w:sz="1"/>
-              <w:bottom w:val="single" w:color="CCCCCC" w:sz="1"/>
-              <w:right w:val="single" w:color="CCCCCC" w:sz="1"/>
-            </w:tcBorders>
-            <w:tcMar>
-              <w:top w:type="dxa" w:w="45"/>
-              <w:left w:type="dxa" w:w="70"/>
-              <w:bottom w:type="dxa" w:w="45"/>
-              <w:right w:type="dxa" w:w="70"/>
-            </w:tcMar>
-          </w:tcPr>
-          <w:p>
-            <w:r>
-              <w:rPr>
-                <w:rFonts w:ascii="Arial" w:cs="Arial" w:eastAsia="Arial" w:hAnsi="Arial"/>
-                <w:sz w:val="17"/>
-                <w:szCs w:val="17"/>
-              </w:rPr>
-              <w:t xml:space="preserve">/simulator</w:t>
-            </w:r>
-          </w:p>
-        </w:tc>
-        <w:tc>
-          <w:tcPr>
-            <w:tcW w:type="auto" w:w="0"/>
-            <w:tcBorders>
-              <w:top w:val="single" w:color="CCCCCC" w:sz="1"/>
-              <w:left w:val="single" w:color="CCCCCC" w:sz="1"/>
-              <w:bottom w:val="single" w:color="CCCCCC" w:sz="1"/>
-              <w:right w:val="single" w:color="CCCCCC" w:sz="1"/>
-            </w:tcBorders>
-            <w:tcMar>
-              <w:top w:type="dxa" w:w="45"/>
-              <w:left w:type="dxa" w:w="70"/>
-              <w:bottom w:type="dxa" w:w="45"/>
-              <w:right w:type="dxa" w:w="70"/>
-            </w:tcMar>
-          </w:tcPr>
-          <w:p>
-            <w:r>
-              <w:rPr>
-                <w:rFonts w:ascii="Arial" w:cs="Arial" w:eastAsia="Arial" w:hAnsi="Arial"/>
-                <w:sz w:val="17"/>
-                <w:szCs w:val="17"/>
-              </w:rPr>
-              <w:t xml:space="preserve">PPO RL 12주</w:t>
+              <w:t xml:space="preserve">생활패턴</w:t>
+            </w:r>
+          </w:p>
+        </w:tc>
+        <w:tc>
+          <w:tcPr>
+            <w:tcW w:type="auto" w:w="0"/>
+            <w:tcBorders>
+              <w:top w:val="single" w:color="CCCCCC" w:sz="1"/>
+              <w:left w:val="single" w:color="CCCCCC" w:sz="1"/>
+              <w:bottom w:val="single" w:color="CCCCCC" w:sz="1"/>
+              <w:right w:val="single" w:color="CCCCCC" w:sz="1"/>
+            </w:tcBorders>
+            <w:tcMar>
+              <w:top w:type="dxa" w:w="45"/>
+              <w:left w:type="dxa" w:w="70"/>
+              <w:bottom w:type="dxa" w:w="45"/>
+              <w:right w:type="dxa" w:w="70"/>
+            </w:tcMar>
+          </w:tcPr>
+          <w:p>
+            <w:r>
+              <w:rPr>
+                <w:rFonts w:ascii="Arial" w:cs="Arial" w:eastAsia="Arial" w:hAnsi="Arial"/>
+                <w:sz w:val="17"/>
+                <w:szCs w:val="17"/>
+              </w:rPr>
+              <w:t xml:space="preserve">/schedule</w:t>
+            </w:r>
+          </w:p>
+        </w:tc>
+        <w:tc>
+          <w:tcPr>
+            <w:tcW w:type="auto" w:w="0"/>
+            <w:tcBorders>
+              <w:top w:val="single" w:color="CCCCCC" w:sz="1"/>
+              <w:left w:val="single" w:color="CCCCCC" w:sz="1"/>
+              <w:bottom w:val="single" w:color="CCCCCC" w:sz="1"/>
+              <w:right w:val="single" w:color="CCCCCC" w:sz="1"/>
+            </w:tcBorders>
+            <w:tcMar>
+              <w:top w:type="dxa" w:w="45"/>
+              <w:left w:type="dxa" w:w="70"/>
+              <w:bottom w:type="dxa" w:w="45"/>
+              <w:right w:type="dxa" w:w="70"/>
+            </w:tcMar>
+          </w:tcPr>
+          <w:p>
+            <w:r>
+              <w:rPr>
+                <w:rFonts w:ascii="Arial" w:cs="Arial" w:eastAsia="Arial" w:hAnsi="Arial"/>
+                <w:sz w:val="17"/>
+                <w:szCs w:val="17"/>
+              </w:rPr>
+              <w:t xml:space="preserve">24시간 원형 시계 + N일 시뮬</w:t>
             </w:r>
           </w:p>
         </w:tc>
@@ -2938,61 +2951,61 @@
                 <w:sz w:val="17"/>
                 <w:szCs w:val="17"/>
               </w:rPr>
-              <w:t xml:space="preserve">생활패턴</w:t>
-            </w:r>
-          </w:p>
-        </w:tc>
-        <w:tc>
-          <w:tcPr>
-            <w:tcW w:type="auto" w:w="0"/>
-            <w:tcBorders>
-              <w:top w:val="single" w:color="CCCCCC" w:sz="1"/>
-              <w:left w:val="single" w:color="CCCCCC" w:sz="1"/>
-              <w:bottom w:val="single" w:color="CCCCCC" w:sz="1"/>
-              <w:right w:val="single" w:color="CCCCCC" w:sz="1"/>
-            </w:tcBorders>
-            <w:tcMar>
-              <w:top w:type="dxa" w:w="45"/>
-              <w:left w:type="dxa" w:w="70"/>
-              <w:bottom w:type="dxa" w:w="45"/>
-              <w:right w:type="dxa" w:w="70"/>
-            </w:tcMar>
-          </w:tcPr>
-          <w:p>
-            <w:r>
-              <w:rPr>
-                <w:rFonts w:ascii="Arial" w:cs="Arial" w:eastAsia="Arial" w:hAnsi="Arial"/>
-                <w:sz w:val="17"/>
-                <w:szCs w:val="17"/>
-              </w:rPr>
-              <w:t xml:space="preserve">/schedule</w:t>
-            </w:r>
-          </w:p>
-        </w:tc>
-        <w:tc>
-          <w:tcPr>
-            <w:tcW w:type="auto" w:w="0"/>
-            <w:tcBorders>
-              <w:top w:val="single" w:color="CCCCCC" w:sz="1"/>
-              <w:left w:val="single" w:color="CCCCCC" w:sz="1"/>
-              <w:bottom w:val="single" w:color="CCCCCC" w:sz="1"/>
-              <w:right w:val="single" w:color="CCCCCC" w:sz="1"/>
-            </w:tcBorders>
-            <w:tcMar>
-              <w:top w:type="dxa" w:w="45"/>
-              <w:left w:type="dxa" w:w="70"/>
-              <w:bottom w:type="dxa" w:w="45"/>
-              <w:right w:type="dxa" w:w="70"/>
-            </w:tcMar>
-          </w:tcPr>
-          <w:p>
-            <w:r>
-              <w:rPr>
-                <w:rFonts w:ascii="Arial" w:cs="Arial" w:eastAsia="Arial" w:hAnsi="Arial"/>
-                <w:sz w:val="17"/>
-                <w:szCs w:val="17"/>
-              </w:rPr>
-              <w:t xml:space="preserve">24시간 원형 시계</w:t>
+              <w:t xml:space="preserve">가상인물</w:t>
+            </w:r>
+          </w:p>
+        </w:tc>
+        <w:tc>
+          <w:tcPr>
+            <w:tcW w:type="auto" w:w="0"/>
+            <w:tcBorders>
+              <w:top w:val="single" w:color="CCCCCC" w:sz="1"/>
+              <w:left w:val="single" w:color="CCCCCC" w:sz="1"/>
+              <w:bottom w:val="single" w:color="CCCCCC" w:sz="1"/>
+              <w:right w:val="single" w:color="CCCCCC" w:sz="1"/>
+            </w:tcBorders>
+            <w:tcMar>
+              <w:top w:type="dxa" w:w="45"/>
+              <w:left w:type="dxa" w:w="70"/>
+              <w:bottom w:type="dxa" w:w="45"/>
+              <w:right w:type="dxa" w:w="70"/>
+            </w:tcMar>
+          </w:tcPr>
+          <w:p>
+            <w:r>
+              <w:rPr>
+                <w:rFonts w:ascii="Arial" w:cs="Arial" w:eastAsia="Arial" w:hAnsi="Arial"/>
+                <w:sz w:val="17"/>
+                <w:szCs w:val="17"/>
+              </w:rPr>
+              <w:t xml:space="preserve">/avatar</w:t>
+            </w:r>
+          </w:p>
+        </w:tc>
+        <w:tc>
+          <w:tcPr>
+            <w:tcW w:type="auto" w:w="0"/>
+            <w:tcBorders>
+              <w:top w:val="single" w:color="CCCCCC" w:sz="1"/>
+              <w:left w:val="single" w:color="CCCCCC" w:sz="1"/>
+              <w:bottom w:val="single" w:color="CCCCCC" w:sz="1"/>
+              <w:right w:val="single" w:color="CCCCCC" w:sz="1"/>
+            </w:tcBorders>
+            <w:tcMar>
+              <w:top w:type="dxa" w:w="45"/>
+              <w:left w:type="dxa" w:w="70"/>
+              <w:bottom w:type="dxa" w:w="45"/>
+              <w:right w:type="dxa" w:w="70"/>
+            </w:tcMar>
+          </w:tcPr>
+          <w:p>
+            <w:r>
+              <w:rPr>
+                <w:rFonts w:ascii="Arial" w:cs="Arial" w:eastAsia="Arial" w:hAnsi="Arial"/>
+                <w:sz w:val="17"/>
+                <w:szCs w:val="17"/>
+              </w:rPr>
+              <w:t xml:space="preserve">걷기 아바타 + BMI 체형 변화</w:t>
             </w:r>
           </w:p>
         </w:tc>
@@ -3021,61 +3034,61 @@
                 <w:sz w:val="17"/>
                 <w:szCs w:val="17"/>
               </w:rPr>
-              <w:t xml:space="preserve">가상인물</w:t>
-            </w:r>
-          </w:p>
-        </w:tc>
-        <w:tc>
-          <w:tcPr>
-            <w:tcW w:type="auto" w:w="0"/>
-            <w:tcBorders>
-              <w:top w:val="single" w:color="CCCCCC" w:sz="1"/>
-              <w:left w:val="single" w:color="CCCCCC" w:sz="1"/>
-              <w:bottom w:val="single" w:color="CCCCCC" w:sz="1"/>
-              <w:right w:val="single" w:color="CCCCCC" w:sz="1"/>
-            </w:tcBorders>
-            <w:tcMar>
-              <w:top w:type="dxa" w:w="45"/>
-              <w:left w:type="dxa" w:w="70"/>
-              <w:bottom w:type="dxa" w:w="45"/>
-              <w:right w:type="dxa" w:w="70"/>
-            </w:tcMar>
-          </w:tcPr>
-          <w:p>
-            <w:r>
-              <w:rPr>
-                <w:rFonts w:ascii="Arial" w:cs="Arial" w:eastAsia="Arial" w:hAnsi="Arial"/>
-                <w:sz w:val="17"/>
-                <w:szCs w:val="17"/>
-              </w:rPr>
-              <w:t xml:space="preserve">/avatar</w:t>
-            </w:r>
-          </w:p>
-        </w:tc>
-        <w:tc>
-          <w:tcPr>
-            <w:tcW w:type="auto" w:w="0"/>
-            <w:tcBorders>
-              <w:top w:val="single" w:color="CCCCCC" w:sz="1"/>
-              <w:left w:val="single" w:color="CCCCCC" w:sz="1"/>
-              <w:bottom w:val="single" w:color="CCCCCC" w:sz="1"/>
-              <w:right w:val="single" w:color="CCCCCC" w:sz="1"/>
-            </w:tcBorders>
-            <w:tcMar>
-              <w:top w:type="dxa" w:w="45"/>
-              <w:left w:type="dxa" w:w="70"/>
-              <w:bottom w:type="dxa" w:w="45"/>
-              <w:right w:type="dxa" w:w="70"/>
-            </w:tcMar>
-          </w:tcPr>
-          <w:p>
-            <w:r>
-              <w:rPr>
-                <w:rFonts w:ascii="Arial" w:cs="Arial" w:eastAsia="Arial" w:hAnsi="Arial"/>
-                <w:sz w:val="17"/>
-                <w:szCs w:val="17"/>
-              </w:rPr>
-              <w:t xml:space="preserve">걷기 아바타 + BMI</w:t>
+              <w:t xml:space="preserve">주간리포트</w:t>
+            </w:r>
+          </w:p>
+        </w:tc>
+        <w:tc>
+          <w:tcPr>
+            <w:tcW w:type="auto" w:w="0"/>
+            <w:tcBorders>
+              <w:top w:val="single" w:color="CCCCCC" w:sz="1"/>
+              <w:left w:val="single" w:color="CCCCCC" w:sz="1"/>
+              <w:bottom w:val="single" w:color="CCCCCC" w:sz="1"/>
+              <w:right w:val="single" w:color="CCCCCC" w:sz="1"/>
+            </w:tcBorders>
+            <w:tcMar>
+              <w:top w:type="dxa" w:w="45"/>
+              <w:left w:type="dxa" w:w="70"/>
+              <w:bottom w:type="dxa" w:w="45"/>
+              <w:right w:type="dxa" w:w="70"/>
+            </w:tcMar>
+          </w:tcPr>
+          <w:p>
+            <w:r>
+              <w:rPr>
+                <w:rFonts w:ascii="Arial" w:cs="Arial" w:eastAsia="Arial" w:hAnsi="Arial"/>
+                <w:sz w:val="17"/>
+                <w:szCs w:val="17"/>
+              </w:rPr>
+              <w:t xml:space="preserve">/report</w:t>
+            </w:r>
+          </w:p>
+        </w:tc>
+        <w:tc>
+          <w:tcPr>
+            <w:tcW w:type="auto" w:w="0"/>
+            <w:tcBorders>
+              <w:top w:val="single" w:color="CCCCCC" w:sz="1"/>
+              <w:left w:val="single" w:color="CCCCCC" w:sz="1"/>
+              <w:bottom w:val="single" w:color="CCCCCC" w:sz="1"/>
+              <w:right w:val="single" w:color="CCCCCC" w:sz="1"/>
+            </w:tcBorders>
+            <w:tcMar>
+              <w:top w:type="dxa" w:w="45"/>
+              <w:left w:type="dxa" w:w="70"/>
+              <w:bottom w:type="dxa" w:w="45"/>
+              <w:right w:type="dxa" w:w="70"/>
+            </w:tcMar>
+          </w:tcPr>
+          <w:p>
+            <w:r>
+              <w:rPr>
+                <w:rFonts w:ascii="Arial" w:cs="Arial" w:eastAsia="Arial" w:hAnsi="Arial"/>
+                <w:sz w:val="17"/>
+                <w:szCs w:val="17"/>
+              </w:rPr>
+              <w:t xml:space="preserve">레이더+바+신뢰구간+아바타 비교</w:t>
             </w:r>
           </w:p>
         </w:tc>
@@ -3104,61 +3117,61 @@
                 <w:sz w:val="17"/>
                 <w:szCs w:val="17"/>
               </w:rPr>
-              <w:t xml:space="preserve">주간리포트</w:t>
-            </w:r>
-          </w:p>
-        </w:tc>
-        <w:tc>
-          <w:tcPr>
-            <w:tcW w:type="auto" w:w="0"/>
-            <w:tcBorders>
-              <w:top w:val="single" w:color="CCCCCC" w:sz="1"/>
-              <w:left w:val="single" w:color="CCCCCC" w:sz="1"/>
-              <w:bottom w:val="single" w:color="CCCCCC" w:sz="1"/>
-              <w:right w:val="single" w:color="CCCCCC" w:sz="1"/>
-            </w:tcBorders>
-            <w:tcMar>
-              <w:top w:type="dxa" w:w="45"/>
-              <w:left w:type="dxa" w:w="70"/>
-              <w:bottom w:type="dxa" w:w="45"/>
-              <w:right w:type="dxa" w:w="70"/>
-            </w:tcMar>
-          </w:tcPr>
-          <w:p>
-            <w:r>
-              <w:rPr>
-                <w:rFonts w:ascii="Arial" w:cs="Arial" w:eastAsia="Arial" w:hAnsi="Arial"/>
-                <w:sz w:val="17"/>
-                <w:szCs w:val="17"/>
-              </w:rPr>
-              <w:t xml:space="preserve">/report</w:t>
-            </w:r>
-          </w:p>
-        </w:tc>
-        <w:tc>
-          <w:tcPr>
-            <w:tcW w:type="auto" w:w="0"/>
-            <w:tcBorders>
-              <w:top w:val="single" w:color="CCCCCC" w:sz="1"/>
-              <w:left w:val="single" w:color="CCCCCC" w:sz="1"/>
-              <w:bottom w:val="single" w:color="CCCCCC" w:sz="1"/>
-              <w:right w:val="single" w:color="CCCCCC" w:sz="1"/>
-            </w:tcBorders>
-            <w:tcMar>
-              <w:top w:type="dxa" w:w="45"/>
-              <w:left w:type="dxa" w:w="70"/>
-              <w:bottom w:type="dxa" w:w="45"/>
-              <w:right w:type="dxa" w:w="70"/>
-            </w:tcMar>
-          </w:tcPr>
-          <w:p>
-            <w:r>
-              <w:rPr>
-                <w:rFonts w:ascii="Arial" w:cs="Arial" w:eastAsia="Arial" w:hAnsi="Arial"/>
-                <w:sz w:val="17"/>
-                <w:szCs w:val="17"/>
-              </w:rPr>
-              <w:t xml:space="preserve">레이더+바+신뢰구간</w:t>
+              <w:t xml:space="preserve">아키텍처</w:t>
+            </w:r>
+          </w:p>
+        </w:tc>
+        <w:tc>
+          <w:tcPr>
+            <w:tcW w:type="auto" w:w="0"/>
+            <w:tcBorders>
+              <w:top w:val="single" w:color="CCCCCC" w:sz="1"/>
+              <w:left w:val="single" w:color="CCCCCC" w:sz="1"/>
+              <w:bottom w:val="single" w:color="CCCCCC" w:sz="1"/>
+              <w:right w:val="single" w:color="CCCCCC" w:sz="1"/>
+            </w:tcBorders>
+            <w:tcMar>
+              <w:top w:type="dxa" w:w="45"/>
+              <w:left w:type="dxa" w:w="70"/>
+              <w:bottom w:type="dxa" w:w="45"/>
+              <w:right w:type="dxa" w:w="70"/>
+            </w:tcMar>
+          </w:tcPr>
+          <w:p>
+            <w:r>
+              <w:rPr>
+                <w:rFonts w:ascii="Arial" w:cs="Arial" w:eastAsia="Arial" w:hAnsi="Arial"/>
+                <w:sz w:val="17"/>
+                <w:szCs w:val="17"/>
+              </w:rPr>
+              <w:t xml:space="preserve">/architecture</w:t>
+            </w:r>
+          </w:p>
+        </w:tc>
+        <w:tc>
+          <w:tcPr>
+            <w:tcW w:type="auto" w:w="0"/>
+            <w:tcBorders>
+              <w:top w:val="single" w:color="CCCCCC" w:sz="1"/>
+              <w:left w:val="single" w:color="CCCCCC" w:sz="1"/>
+              <w:bottom w:val="single" w:color="CCCCCC" w:sz="1"/>
+              <w:right w:val="single" w:color="CCCCCC" w:sz="1"/>
+            </w:tcBorders>
+            <w:tcMar>
+              <w:top w:type="dxa" w:w="45"/>
+              <w:left w:type="dxa" w:w="70"/>
+              <w:bottom w:type="dxa" w:w="45"/>
+              <w:right w:type="dxa" w:w="70"/>
+            </w:tcMar>
+          </w:tcPr>
+          <w:p>
+            <w:r>
+              <w:rPr>
+                <w:rFonts w:ascii="Arial" w:cs="Arial" w:eastAsia="Arial" w:hAnsi="Arial"/>
+                <w:sz w:val="17"/>
+                <w:szCs w:val="17"/>
+              </w:rPr>
+              <w:t xml:space="preserve">34노드 인터랙티브 시스템맵</w:t>
             </w:r>
           </w:p>
         </w:tc>
@@ -3187,61 +3200,61 @@
                 <w:sz w:val="17"/>
                 <w:szCs w:val="17"/>
               </w:rPr>
-              <w:t xml:space="preserve">아키텍처</w:t>
-            </w:r>
-          </w:p>
-        </w:tc>
-        <w:tc>
-          <w:tcPr>
-            <w:tcW w:type="auto" w:w="0"/>
-            <w:tcBorders>
-              <w:top w:val="single" w:color="CCCCCC" w:sz="1"/>
-              <w:left w:val="single" w:color="CCCCCC" w:sz="1"/>
-              <w:bottom w:val="single" w:color="CCCCCC" w:sz="1"/>
-              <w:right w:val="single" w:color="CCCCCC" w:sz="1"/>
-            </w:tcBorders>
-            <w:tcMar>
-              <w:top w:type="dxa" w:w="45"/>
-              <w:left w:type="dxa" w:w="70"/>
-              <w:bottom w:type="dxa" w:w="45"/>
-              <w:right w:type="dxa" w:w="70"/>
-            </w:tcMar>
-          </w:tcPr>
-          <w:p>
-            <w:r>
-              <w:rPr>
-                <w:rFonts w:ascii="Arial" w:cs="Arial" w:eastAsia="Arial" w:hAnsi="Arial"/>
-                <w:sz w:val="17"/>
-                <w:szCs w:val="17"/>
-              </w:rPr>
-              <w:t xml:space="preserve">/architecture</w:t>
-            </w:r>
-          </w:p>
-        </w:tc>
-        <w:tc>
-          <w:tcPr>
-            <w:tcW w:type="auto" w:w="0"/>
-            <w:tcBorders>
-              <w:top w:val="single" w:color="CCCCCC" w:sz="1"/>
-              <w:left w:val="single" w:color="CCCCCC" w:sz="1"/>
-              <w:bottom w:val="single" w:color="CCCCCC" w:sz="1"/>
-              <w:right w:val="single" w:color="CCCCCC" w:sz="1"/>
-            </w:tcBorders>
-            <w:tcMar>
-              <w:top w:type="dxa" w:w="45"/>
-              <w:left w:type="dxa" w:w="70"/>
-              <w:bottom w:type="dxa" w:w="45"/>
-              <w:right w:type="dxa" w:w="70"/>
-            </w:tcMar>
-          </w:tcPr>
-          <w:p>
-            <w:r>
-              <w:rPr>
-                <w:rFonts w:ascii="Arial" w:cs="Arial" w:eastAsia="Arial" w:hAnsi="Arial"/>
-                <w:sz w:val="17"/>
-                <w:szCs w:val="17"/>
-              </w:rPr>
-              <w:t xml:space="preserve">60+ 노드 시스템맵</w:t>
+              <w:t xml:space="preserve">관리자</w:t>
+            </w:r>
+          </w:p>
+        </w:tc>
+        <w:tc>
+          <w:tcPr>
+            <w:tcW w:type="auto" w:w="0"/>
+            <w:tcBorders>
+              <w:top w:val="single" w:color="CCCCCC" w:sz="1"/>
+              <w:left w:val="single" w:color="CCCCCC" w:sz="1"/>
+              <w:bottom w:val="single" w:color="CCCCCC" w:sz="1"/>
+              <w:right w:val="single" w:color="CCCCCC" w:sz="1"/>
+            </w:tcBorders>
+            <w:tcMar>
+              <w:top w:type="dxa" w:w="45"/>
+              <w:left w:type="dxa" w:w="70"/>
+              <w:bottom w:type="dxa" w:w="45"/>
+              <w:right w:type="dxa" w:w="70"/>
+            </w:tcMar>
+          </w:tcPr>
+          <w:p>
+            <w:r>
+              <w:rPr>
+                <w:rFonts w:ascii="Arial" w:cs="Arial" w:eastAsia="Arial" w:hAnsi="Arial"/>
+                <w:sz w:val="17"/>
+                <w:szCs w:val="17"/>
+              </w:rPr>
+              <w:t xml:space="preserve">/admin</w:t>
+            </w:r>
+          </w:p>
+        </w:tc>
+        <w:tc>
+          <w:tcPr>
+            <w:tcW w:type="auto" w:w="0"/>
+            <w:tcBorders>
+              <w:top w:val="single" w:color="CCCCCC" w:sz="1"/>
+              <w:left w:val="single" w:color="CCCCCC" w:sz="1"/>
+              <w:bottom w:val="single" w:color="CCCCCC" w:sz="1"/>
+              <w:right w:val="single" w:color="CCCCCC" w:sz="1"/>
+            </w:tcBorders>
+            <w:tcMar>
+              <w:top w:type="dxa" w:w="45"/>
+              <w:left w:type="dxa" w:w="70"/>
+              <w:bottom w:type="dxa" w:w="45"/>
+              <w:right w:type="dxa" w:w="70"/>
+            </w:tcMar>
+          </w:tcPr>
+          <w:p>
+            <w:r>
+              <w:rPr>
+                <w:rFonts w:ascii="Arial" w:cs="Arial" w:eastAsia="Arial" w:hAnsi="Arial"/>
+                <w:sz w:val="17"/>
+                <w:szCs w:val="17"/>
+              </w:rPr>
+              <w:t xml:space="preserve">서버/플러그인/GPU/API키 상태</w:t>
             </w:r>
           </w:p>
         </w:tc>
@@ -3270,89 +3283,6 @@
                 <w:sz w:val="17"/>
                 <w:szCs w:val="17"/>
               </w:rPr>
-              <w:t xml:space="preserve">관리자</w:t>
-            </w:r>
-          </w:p>
-        </w:tc>
-        <w:tc>
-          <w:tcPr>
-            <w:tcW w:type="auto" w:w="0"/>
-            <w:tcBorders>
-              <w:top w:val="single" w:color="CCCCCC" w:sz="1"/>
-              <w:left w:val="single" w:color="CCCCCC" w:sz="1"/>
-              <w:bottom w:val="single" w:color="CCCCCC" w:sz="1"/>
-              <w:right w:val="single" w:color="CCCCCC" w:sz="1"/>
-            </w:tcBorders>
-            <w:tcMar>
-              <w:top w:type="dxa" w:w="45"/>
-              <w:left w:type="dxa" w:w="70"/>
-              <w:bottom w:type="dxa" w:w="45"/>
-              <w:right w:type="dxa" w:w="70"/>
-            </w:tcMar>
-          </w:tcPr>
-          <w:p>
-            <w:r>
-              <w:rPr>
-                <w:rFonts w:ascii="Arial" w:cs="Arial" w:eastAsia="Arial" w:hAnsi="Arial"/>
-                <w:sz w:val="17"/>
-                <w:szCs w:val="17"/>
-              </w:rPr>
-              <w:t xml:space="preserve">/admin</w:t>
-            </w:r>
-          </w:p>
-        </w:tc>
-        <w:tc>
-          <w:tcPr>
-            <w:tcW w:type="auto" w:w="0"/>
-            <w:tcBorders>
-              <w:top w:val="single" w:color="CCCCCC" w:sz="1"/>
-              <w:left w:val="single" w:color="CCCCCC" w:sz="1"/>
-              <w:bottom w:val="single" w:color="CCCCCC" w:sz="1"/>
-              <w:right w:val="single" w:color="CCCCCC" w:sz="1"/>
-            </w:tcBorders>
-            <w:tcMar>
-              <w:top w:type="dxa" w:w="45"/>
-              <w:left w:type="dxa" w:w="70"/>
-              <w:bottom w:type="dxa" w:w="45"/>
-              <w:right w:type="dxa" w:w="70"/>
-            </w:tcMar>
-          </w:tcPr>
-          <w:p>
-            <w:r>
-              <w:rPr>
-                <w:rFonts w:ascii="Arial" w:cs="Arial" w:eastAsia="Arial" w:hAnsi="Arial"/>
-                <w:sz w:val="17"/>
-                <w:szCs w:val="17"/>
-              </w:rPr>
-              <w:t xml:space="preserve">서버/플러그인/GPU</w:t>
-            </w:r>
-          </w:p>
-        </w:tc>
-      </w:tr>
-      <w:tr>
-        <w:tc>
-          <w:tcPr>
-            <w:tcW w:type="auto" w:w="0"/>
-            <w:tcBorders>
-              <w:top w:val="single" w:color="CCCCCC" w:sz="1"/>
-              <w:left w:val="single" w:color="CCCCCC" w:sz="1"/>
-              <w:bottom w:val="single" w:color="CCCCCC" w:sz="1"/>
-              <w:right w:val="single" w:color="CCCCCC" w:sz="1"/>
-            </w:tcBorders>
-            <w:tcMar>
-              <w:top w:type="dxa" w:w="45"/>
-              <w:left w:type="dxa" w:w="70"/>
-              <w:bottom w:type="dxa" w:w="45"/>
-              <w:right w:type="dxa" w:w="70"/>
-            </w:tcMar>
-          </w:tcPr>
-          <w:p>
-            <w:r>
-              <w:rPr>
-                <w:rFonts w:ascii="Arial" w:cs="Arial" w:eastAsia="Arial" w:hAnsi="Arial"/>
-                <w:sz w:val="17"/>
-                <w:szCs w:val="17"/>
-              </w:rPr>
               <w:t xml:space="preserve">전체 관리</w:t>
             </w:r>
           </w:p>
@@ -3407,7 +3337,7 @@
                 <w:sz w:val="17"/>
                 <w:szCs w:val="17"/>
               </w:rPr>
-              <w:t xml:space="preserve">4탭 팀 관리</w:t>
+              <w:t xml:space="preserve">4탭 (아키텍처/팀활동/백업/보안)</w:t>
             </w:r>
           </w:p>
         </w:tc>
@@ -8126,7 +8056,7 @@
                 <w:sz w:val="17"/>
                 <w:szCs w:val="17"/>
               </w:rPr>
-              <w:t xml:space="preserve">프로덕션: JWT_SECRET 필수</w:t>
+              <w:t xml:space="preserve">프로덕션: JWT_SECRET 필수, sessionStorage 저장</w:t>
             </w:r>
           </w:p>
         </w:tc>
@@ -8155,61 +8085,61 @@
                 <w:sz w:val="17"/>
                 <w:szCs w:val="17"/>
               </w:rPr>
-              <w:t xml:space="preserve">WebSocket</w:t>
-            </w:r>
-          </w:p>
-        </w:tc>
-        <w:tc>
-          <w:tcPr>
-            <w:tcW w:type="auto" w:w="0"/>
-            <w:tcBorders>
-              <w:top w:val="single" w:color="CCCCCC" w:sz="1"/>
-              <w:left w:val="single" w:color="CCCCCC" w:sz="1"/>
-              <w:bottom w:val="single" w:color="CCCCCC" w:sz="1"/>
-              <w:right w:val="single" w:color="CCCCCC" w:sz="1"/>
-            </w:tcBorders>
-            <w:tcMar>
-              <w:top w:type="dxa" w:w="45"/>
-              <w:left w:type="dxa" w:w="70"/>
-              <w:bottom w:type="dxa" w:w="45"/>
-              <w:right w:type="dxa" w:w="70"/>
-            </w:tcMar>
-          </w:tcPr>
-          <w:p>
-            <w:r>
-              <w:rPr>
-                <w:rFonts w:ascii="Arial" w:cs="Arial" w:eastAsia="Arial" w:hAnsi="Arial"/>
-                <w:sz w:val="17"/>
-                <w:szCs w:val="17"/>
-              </w:rPr>
-              <w:t xml:space="preserve">토큰 검증</w:t>
-            </w:r>
-          </w:p>
-        </w:tc>
-        <w:tc>
-          <w:tcPr>
-            <w:tcW w:type="auto" w:w="0"/>
-            <w:tcBorders>
-              <w:top w:val="single" w:color="CCCCCC" w:sz="1"/>
-              <w:left w:val="single" w:color="CCCCCC" w:sz="1"/>
-              <w:bottom w:val="single" w:color="CCCCCC" w:sz="1"/>
-              <w:right w:val="single" w:color="CCCCCC" w:sz="1"/>
-            </w:tcBorders>
-            <w:tcMar>
-              <w:top w:type="dxa" w:w="45"/>
-              <w:left w:type="dxa" w:w="70"/>
-              <w:bottom w:type="dxa" w:w="45"/>
-              <w:right w:type="dxa" w:w="70"/>
-            </w:tcMar>
-          </w:tcPr>
-          <w:p>
-            <w:r>
-              <w:rPr>
-                <w:rFonts w:ascii="Arial" w:cs="Arial" w:eastAsia="Arial" w:hAnsi="Arial"/>
-                <w:sz w:val="17"/>
-                <w:szCs w:val="17"/>
-              </w:rPr>
-              <w:t xml:space="preserve">프로덕션: 미인증 거부</w:t>
+              <w:t xml:space="preserve">요청 인터셉터</w:t>
+            </w:r>
+          </w:p>
+        </w:tc>
+        <w:tc>
+          <w:tcPr>
+            <w:tcW w:type="auto" w:w="0"/>
+            <w:tcBorders>
+              <w:top w:val="single" w:color="CCCCCC" w:sz="1"/>
+              <w:left w:val="single" w:color="CCCCCC" w:sz="1"/>
+              <w:bottom w:val="single" w:color="CCCCCC" w:sz="1"/>
+              <w:right w:val="single" w:color="CCCCCC" w:sz="1"/>
+            </w:tcBorders>
+            <w:tcMar>
+              <w:top w:type="dxa" w:w="45"/>
+              <w:left w:type="dxa" w:w="70"/>
+              <w:bottom w:type="dxa" w:w="45"/>
+              <w:right w:type="dxa" w:w="70"/>
+            </w:tcMar>
+          </w:tcPr>
+          <w:p>
+            <w:r>
+              <w:rPr>
+                <w:rFonts w:ascii="Arial" w:cs="Arial" w:eastAsia="Arial" w:hAnsi="Arial"/>
+                <w:sz w:val="17"/>
+                <w:szCs w:val="17"/>
+              </w:rPr>
+              <w:t xml:space="preserve">axios</w:t>
+            </w:r>
+          </w:p>
+        </w:tc>
+        <w:tc>
+          <w:tcPr>
+            <w:tcW w:type="auto" w:w="0"/>
+            <w:tcBorders>
+              <w:top w:val="single" w:color="CCCCCC" w:sz="1"/>
+              <w:left w:val="single" w:color="CCCCCC" w:sz="1"/>
+              <w:bottom w:val="single" w:color="CCCCCC" w:sz="1"/>
+              <w:right w:val="single" w:color="CCCCCC" w:sz="1"/>
+            </w:tcBorders>
+            <w:tcMar>
+              <w:top w:type="dxa" w:w="45"/>
+              <w:left w:type="dxa" w:w="70"/>
+              <w:bottom w:type="dxa" w:w="45"/>
+              <w:right w:type="dxa" w:w="70"/>
+            </w:tcMar>
+          </w:tcPr>
+          <w:p>
+            <w:r>
+              <w:rPr>
+                <w:rFonts w:ascii="Arial" w:cs="Arial" w:eastAsia="Arial" w:hAnsi="Arial"/>
+                <w:sz w:val="17"/>
+                <w:szCs w:val="17"/>
+              </w:rPr>
+              <w:t xml:space="preserve">모든 API 요청에 Authorization 헤더 자동 추가</w:t>
             </w:r>
           </w:p>
         </w:tc>
@@ -8238,61 +8168,61 @@
                 <w:sz w:val="17"/>
                 <w:szCs w:val="17"/>
               </w:rPr>
-              <w:t xml:space="preserve">Rate Limit</w:t>
-            </w:r>
-          </w:p>
-        </w:tc>
-        <w:tc>
-          <w:tcPr>
-            <w:tcW w:type="auto" w:w="0"/>
-            <w:tcBorders>
-              <w:top w:val="single" w:color="CCCCCC" w:sz="1"/>
-              <w:left w:val="single" w:color="CCCCCC" w:sz="1"/>
-              <w:bottom w:val="single" w:color="CCCCCC" w:sz="1"/>
-              <w:right w:val="single" w:color="CCCCCC" w:sz="1"/>
-            </w:tcBorders>
-            <w:tcMar>
-              <w:top w:type="dxa" w:w="45"/>
-              <w:left w:type="dxa" w:w="70"/>
-              <w:bottom w:type="dxa" w:w="45"/>
-              <w:right w:type="dxa" w:w="70"/>
-            </w:tcMar>
-          </w:tcPr>
-          <w:p>
-            <w:r>
-              <w:rPr>
-                <w:rFonts w:ascii="Arial" w:cs="Arial" w:eastAsia="Arial" w:hAnsi="Arial"/>
-                <w:sz w:val="17"/>
-                <w:szCs w:val="17"/>
-              </w:rPr>
-              <w:t xml:space="preserve">IP 기반</w:t>
-            </w:r>
-          </w:p>
-        </w:tc>
-        <w:tc>
-          <w:tcPr>
-            <w:tcW w:type="auto" w:w="0"/>
-            <w:tcBorders>
-              <w:top w:val="single" w:color="CCCCCC" w:sz="1"/>
-              <w:left w:val="single" w:color="CCCCCC" w:sz="1"/>
-              <w:bottom w:val="single" w:color="CCCCCC" w:sz="1"/>
-              <w:right w:val="single" w:color="CCCCCC" w:sz="1"/>
-            </w:tcBorders>
-            <w:tcMar>
-              <w:top w:type="dxa" w:w="45"/>
-              <w:left w:type="dxa" w:w="70"/>
-              <w:bottom w:type="dxa" w:w="45"/>
-              <w:right w:type="dxa" w:w="70"/>
-            </w:tcMar>
-          </w:tcPr>
-          <w:p>
-            <w:r>
-              <w:rPr>
-                <w:rFonts w:ascii="Arial" w:cs="Arial" w:eastAsia="Arial" w:hAnsi="Arial"/>
-                <w:sz w:val="17"/>
-                <w:szCs w:val="17"/>
-              </w:rPr>
-              <w:t xml:space="preserve">분당 60회</w:t>
+              <w:t xml:space="preserve">게스트 제한</w:t>
+            </w:r>
+          </w:p>
+        </w:tc>
+        <w:tc>
+          <w:tcPr>
+            <w:tcW w:type="auto" w:w="0"/>
+            <w:tcBorders>
+              <w:top w:val="single" w:color="CCCCCC" w:sz="1"/>
+              <w:left w:val="single" w:color="CCCCCC" w:sz="1"/>
+              <w:bottom w:val="single" w:color="CCCCCC" w:sz="1"/>
+              <w:right w:val="single" w:color="CCCCCC" w:sz="1"/>
+            </w:tcBorders>
+            <w:tcMar>
+              <w:top w:type="dxa" w:w="45"/>
+              <w:left w:type="dxa" w:w="70"/>
+              <w:bottom w:type="dxa" w:w="45"/>
+              <w:right w:type="dxa" w:w="70"/>
+            </w:tcMar>
+          </w:tcPr>
+          <w:p>
+            <w:r>
+              <w:rPr>
+                <w:rFonts w:ascii="Arial" w:cs="Arial" w:eastAsia="Arial" w:hAnsi="Arial"/>
+                <w:sz w:val="17"/>
+                <w:szCs w:val="17"/>
+              </w:rPr>
+              <w:t xml:space="preserve">isGuest 플래그</w:t>
+            </w:r>
+          </w:p>
+        </w:tc>
+        <w:tc>
+          <w:tcPr>
+            <w:tcW w:type="auto" w:w="0"/>
+            <w:tcBorders>
+              <w:top w:val="single" w:color="CCCCCC" w:sz="1"/>
+              <w:left w:val="single" w:color="CCCCCC" w:sz="1"/>
+              <w:bottom w:val="single" w:color="CCCCCC" w:sz="1"/>
+              <w:right w:val="single" w:color="CCCCCC" w:sz="1"/>
+            </w:tcBorders>
+            <w:tcMar>
+              <w:top w:type="dxa" w:w="45"/>
+              <w:left w:type="dxa" w:w="70"/>
+              <w:bottom w:type="dxa" w:w="45"/>
+              <w:right w:type="dxa" w:w="70"/>
+            </w:tcMar>
+          </w:tcPr>
+          <w:p>
+            <w:r>
+              <w:rPr>
+                <w:rFonts w:ascii="Arial" w:cs="Arial" w:eastAsia="Arial" w:hAnsi="Arial"/>
+                <w:sz w:val="17"/>
+                <w:szCs w:val="17"/>
+              </w:rPr>
+              <w:t xml:space="preserve">읽기만 허용, 솔루션 적용 버튼 비활성화</w:t>
             </w:r>
           </w:p>
         </w:tc>
@@ -8321,61 +8251,61 @@
                 <w:sz w:val="17"/>
                 <w:szCs w:val="17"/>
               </w:rPr>
-              <w:t xml:space="preserve">보안 헤더</w:t>
-            </w:r>
-          </w:p>
-        </w:tc>
-        <w:tc>
-          <w:tcPr>
-            <w:tcW w:type="auto" w:w="0"/>
-            <w:tcBorders>
-              <w:top w:val="single" w:color="CCCCCC" w:sz="1"/>
-              <w:left w:val="single" w:color="CCCCCC" w:sz="1"/>
-              <w:bottom w:val="single" w:color="CCCCCC" w:sz="1"/>
-              <w:right w:val="single" w:color="CCCCCC" w:sz="1"/>
-            </w:tcBorders>
-            <w:tcMar>
-              <w:top w:type="dxa" w:w="45"/>
-              <w:left w:type="dxa" w:w="70"/>
-              <w:bottom w:type="dxa" w:w="45"/>
-              <w:right w:type="dxa" w:w="70"/>
-            </w:tcMar>
-          </w:tcPr>
-          <w:p>
-            <w:r>
-              <w:rPr>
-                <w:rFonts w:ascii="Arial" w:cs="Arial" w:eastAsia="Arial" w:hAnsi="Arial"/>
-                <w:sz w:val="17"/>
-                <w:szCs w:val="17"/>
-              </w:rPr>
-              <w:t xml:space="preserve">4종 자동</w:t>
-            </w:r>
-          </w:p>
-        </w:tc>
-        <w:tc>
-          <w:tcPr>
-            <w:tcW w:type="auto" w:w="0"/>
-            <w:tcBorders>
-              <w:top w:val="single" w:color="CCCCCC" w:sz="1"/>
-              <w:left w:val="single" w:color="CCCCCC" w:sz="1"/>
-              <w:bottom w:val="single" w:color="CCCCCC" w:sz="1"/>
-              <w:right w:val="single" w:color="CCCCCC" w:sz="1"/>
-            </w:tcBorders>
-            <w:tcMar>
-              <w:top w:type="dxa" w:w="45"/>
-              <w:left w:type="dxa" w:w="70"/>
-              <w:bottom w:type="dxa" w:w="45"/>
-              <w:right w:type="dxa" w:w="70"/>
-            </w:tcMar>
-          </w:tcPr>
-          <w:p>
-            <w:r>
-              <w:rPr>
-                <w:rFonts w:ascii="Arial" w:cs="Arial" w:eastAsia="Arial" w:hAnsi="Arial"/>
-                <w:sz w:val="17"/>
-                <w:szCs w:val="17"/>
-              </w:rPr>
-              <w:t xml:space="preserve">XSS, Clickjacking, HSTS, Referrer</w:t>
+              <w:t xml:space="preserve">토큰 저장</w:t>
+            </w:r>
+          </w:p>
+        </w:tc>
+        <w:tc>
+          <w:tcPr>
+            <w:tcW w:type="auto" w:w="0"/>
+            <w:tcBorders>
+              <w:top w:val="single" w:color="CCCCCC" w:sz="1"/>
+              <w:left w:val="single" w:color="CCCCCC" w:sz="1"/>
+              <w:bottom w:val="single" w:color="CCCCCC" w:sz="1"/>
+              <w:right w:val="single" w:color="CCCCCC" w:sz="1"/>
+            </w:tcBorders>
+            <w:tcMar>
+              <w:top w:type="dxa" w:w="45"/>
+              <w:left w:type="dxa" w:w="70"/>
+              <w:bottom w:type="dxa" w:w="45"/>
+              <w:right w:type="dxa" w:w="70"/>
+            </w:tcMar>
+          </w:tcPr>
+          <w:p>
+            <w:r>
+              <w:rPr>
+                <w:rFonts w:ascii="Arial" w:cs="Arial" w:eastAsia="Arial" w:hAnsi="Arial"/>
+                <w:sz w:val="17"/>
+                <w:szCs w:val="17"/>
+              </w:rPr>
+              <w:t xml:space="preserve">sessionStorage</w:t>
+            </w:r>
+          </w:p>
+        </w:tc>
+        <w:tc>
+          <w:tcPr>
+            <w:tcW w:type="auto" w:w="0"/>
+            <w:tcBorders>
+              <w:top w:val="single" w:color="CCCCCC" w:sz="1"/>
+              <w:left w:val="single" w:color="CCCCCC" w:sz="1"/>
+              <w:bottom w:val="single" w:color="CCCCCC" w:sz="1"/>
+              <w:right w:val="single" w:color="CCCCCC" w:sz="1"/>
+            </w:tcBorders>
+            <w:tcMar>
+              <w:top w:type="dxa" w:w="45"/>
+              <w:left w:type="dxa" w:w="70"/>
+              <w:bottom w:type="dxa" w:w="45"/>
+              <w:right w:type="dxa" w:w="70"/>
+            </w:tcMar>
+          </w:tcPr>
+          <w:p>
+            <w:r>
+              <w:rPr>
+                <w:rFonts w:ascii="Arial" w:cs="Arial" w:eastAsia="Arial" w:hAnsi="Arial"/>
+                <w:sz w:val="17"/>
+                <w:szCs w:val="17"/>
+              </w:rPr>
+              <w:t xml:space="preserve">탭 종료 시 자동 삭제 (XSS 방어)</w:t>
             </w:r>
           </w:p>
         </w:tc>
@@ -8404,61 +8334,61 @@
                 <w:sz w:val="17"/>
                 <w:szCs w:val="17"/>
               </w:rPr>
-              <w:t xml:space="preserve">입력 검증</w:t>
-            </w:r>
-          </w:p>
-        </w:tc>
-        <w:tc>
-          <w:tcPr>
-            <w:tcW w:type="auto" w:w="0"/>
-            <w:tcBorders>
-              <w:top w:val="single" w:color="CCCCCC" w:sz="1"/>
-              <w:left w:val="single" w:color="CCCCCC" w:sz="1"/>
-              <w:bottom w:val="single" w:color="CCCCCC" w:sz="1"/>
-              <w:right w:val="single" w:color="CCCCCC" w:sz="1"/>
-            </w:tcBorders>
-            <w:tcMar>
-              <w:top w:type="dxa" w:w="45"/>
-              <w:left w:type="dxa" w:w="70"/>
-              <w:bottom w:type="dxa" w:w="45"/>
-              <w:right w:type="dxa" w:w="70"/>
-            </w:tcMar>
-          </w:tcPr>
-          <w:p>
-            <w:r>
-              <w:rPr>
-                <w:rFonts w:ascii="Arial" w:cs="Arial" w:eastAsia="Arial" w:hAnsi="Arial"/>
-                <w:sz w:val="17"/>
-                <w:szCs w:val="17"/>
-              </w:rPr>
-              <w:t xml:space="preserve">정규식</w:t>
-            </w:r>
-          </w:p>
-        </w:tc>
-        <w:tc>
-          <w:tcPr>
-            <w:tcW w:type="auto" w:w="0"/>
-            <w:tcBorders>
-              <w:top w:val="single" w:color="CCCCCC" w:sz="1"/>
-              <w:left w:val="single" w:color="CCCCCC" w:sz="1"/>
-              <w:bottom w:val="single" w:color="CCCCCC" w:sz="1"/>
-              <w:right w:val="single" w:color="CCCCCC" w:sz="1"/>
-            </w:tcBorders>
-            <w:tcMar>
-              <w:top w:type="dxa" w:w="45"/>
-              <w:left w:type="dxa" w:w="70"/>
-              <w:bottom w:type="dxa" w:w="45"/>
-              <w:right w:type="dxa" w:w="70"/>
-            </w:tcMar>
-          </w:tcPr>
-          <w:p>
-            <w:r>
-              <w:rPr>
-                <w:rFonts w:ascii="Arial" w:cs="Arial" w:eastAsia="Arial" w:hAnsi="Arial"/>
-                <w:sz w:val="17"/>
-                <w:szCs w:val="17"/>
-              </w:rPr>
-              <w:t xml:space="preserve">user_id, 모델명, 파일 확장자</w:t>
+              <w:t xml:space="preserve">WebSocket</w:t>
+            </w:r>
+          </w:p>
+        </w:tc>
+        <w:tc>
+          <w:tcPr>
+            <w:tcW w:type="auto" w:w="0"/>
+            <w:tcBorders>
+              <w:top w:val="single" w:color="CCCCCC" w:sz="1"/>
+              <w:left w:val="single" w:color="CCCCCC" w:sz="1"/>
+              <w:bottom w:val="single" w:color="CCCCCC" w:sz="1"/>
+              <w:right w:val="single" w:color="CCCCCC" w:sz="1"/>
+            </w:tcBorders>
+            <w:tcMar>
+              <w:top w:type="dxa" w:w="45"/>
+              <w:left w:type="dxa" w:w="70"/>
+              <w:bottom w:type="dxa" w:w="45"/>
+              <w:right w:type="dxa" w:w="70"/>
+            </w:tcMar>
+          </w:tcPr>
+          <w:p>
+            <w:r>
+              <w:rPr>
+                <w:rFonts w:ascii="Arial" w:cs="Arial" w:eastAsia="Arial" w:hAnsi="Arial"/>
+                <w:sz w:val="17"/>
+                <w:szCs w:val="17"/>
+              </w:rPr>
+              <w:t xml:space="preserve">토큰 검증</w:t>
+            </w:r>
+          </w:p>
+        </w:tc>
+        <w:tc>
+          <w:tcPr>
+            <w:tcW w:type="auto" w:w="0"/>
+            <w:tcBorders>
+              <w:top w:val="single" w:color="CCCCCC" w:sz="1"/>
+              <w:left w:val="single" w:color="CCCCCC" w:sz="1"/>
+              <w:bottom w:val="single" w:color="CCCCCC" w:sz="1"/>
+              <w:right w:val="single" w:color="CCCCCC" w:sz="1"/>
+            </w:tcBorders>
+            <w:tcMar>
+              <w:top w:type="dxa" w:w="45"/>
+              <w:left w:type="dxa" w:w="70"/>
+              <w:bottom w:type="dxa" w:w="45"/>
+              <w:right w:type="dxa" w:w="70"/>
+            </w:tcMar>
+          </w:tcPr>
+          <w:p>
+            <w:r>
+              <w:rPr>
+                <w:rFonts w:ascii="Arial" w:cs="Arial" w:eastAsia="Arial" w:hAnsi="Arial"/>
+                <w:sz w:val="17"/>
+                <w:szCs w:val="17"/>
+              </w:rPr>
+              <w:t xml:space="preserve">프로덕션: 미인증 거부</w:t>
             </w:r>
           </w:p>
         </w:tc>
@@ -8487,61 +8417,61 @@
                 <w:sz w:val="17"/>
                 <w:szCs w:val="17"/>
               </w:rPr>
-              <w:t xml:space="preserve">경로 보호</w:t>
-            </w:r>
-          </w:p>
-        </w:tc>
-        <w:tc>
-          <w:tcPr>
-            <w:tcW w:type="auto" w:w="0"/>
-            <w:tcBorders>
-              <w:top w:val="single" w:color="CCCCCC" w:sz="1"/>
-              <w:left w:val="single" w:color="CCCCCC" w:sz="1"/>
-              <w:bottom w:val="single" w:color="CCCCCC" w:sz="1"/>
-              <w:right w:val="single" w:color="CCCCCC" w:sz="1"/>
-            </w:tcBorders>
-            <w:tcMar>
-              <w:top w:type="dxa" w:w="45"/>
-              <w:left w:type="dxa" w:w="70"/>
-              <w:bottom w:type="dxa" w:w="45"/>
-              <w:right w:type="dxa" w:w="70"/>
-            </w:tcMar>
-          </w:tcPr>
-          <w:p>
-            <w:r>
-              <w:rPr>
-                <w:rFonts w:ascii="Arial" w:cs="Arial" w:eastAsia="Arial" w:hAnsi="Arial"/>
-                <w:sz w:val="17"/>
-                <w:szCs w:val="17"/>
-              </w:rPr>
-              <w:t xml:space="preserve">PUBLIC_PATHS</w:t>
-            </w:r>
-          </w:p>
-        </w:tc>
-        <w:tc>
-          <w:tcPr>
-            <w:tcW w:type="auto" w:w="0"/>
-            <w:tcBorders>
-              <w:top w:val="single" w:color="CCCCCC" w:sz="1"/>
-              <w:left w:val="single" w:color="CCCCCC" w:sz="1"/>
-              <w:bottom w:val="single" w:color="CCCCCC" w:sz="1"/>
-              <w:right w:val="single" w:color="CCCCCC" w:sz="1"/>
-            </w:tcBorders>
-            <w:tcMar>
-              <w:top w:type="dxa" w:w="45"/>
-              <w:left w:type="dxa" w:w="70"/>
-              <w:bottom w:type="dxa" w:w="45"/>
-              <w:right w:type="dxa" w:w="70"/>
-            </w:tcMar>
-          </w:tcPr>
-          <w:p>
-            <w:r>
-              <w:rPr>
-                <w:rFonts w:ascii="Arial" w:cs="Arial" w:eastAsia="Arial" w:hAnsi="Arial"/>
-                <w:sz w:val="17"/>
-                <w:szCs w:val="17"/>
-              </w:rPr>
-              <w:t xml:space="preserve">관리 API 인증 필요 (v0.4.0)</w:t>
+              <w:t xml:space="preserve">Rate Limit</w:t>
+            </w:r>
+          </w:p>
+        </w:tc>
+        <w:tc>
+          <w:tcPr>
+            <w:tcW w:type="auto" w:w="0"/>
+            <w:tcBorders>
+              <w:top w:val="single" w:color="CCCCCC" w:sz="1"/>
+              <w:left w:val="single" w:color="CCCCCC" w:sz="1"/>
+              <w:bottom w:val="single" w:color="CCCCCC" w:sz="1"/>
+              <w:right w:val="single" w:color="CCCCCC" w:sz="1"/>
+            </w:tcBorders>
+            <w:tcMar>
+              <w:top w:type="dxa" w:w="45"/>
+              <w:left w:type="dxa" w:w="70"/>
+              <w:bottom w:type="dxa" w:w="45"/>
+              <w:right w:type="dxa" w:w="70"/>
+            </w:tcMar>
+          </w:tcPr>
+          <w:p>
+            <w:r>
+              <w:rPr>
+                <w:rFonts w:ascii="Arial" w:cs="Arial" w:eastAsia="Arial" w:hAnsi="Arial"/>
+                <w:sz w:val="17"/>
+                <w:szCs w:val="17"/>
+              </w:rPr>
+              <w:t xml:space="preserve">IP 기반</w:t>
+            </w:r>
+          </w:p>
+        </w:tc>
+        <w:tc>
+          <w:tcPr>
+            <w:tcW w:type="auto" w:w="0"/>
+            <w:tcBorders>
+              <w:top w:val="single" w:color="CCCCCC" w:sz="1"/>
+              <w:left w:val="single" w:color="CCCCCC" w:sz="1"/>
+              <w:bottom w:val="single" w:color="CCCCCC" w:sz="1"/>
+              <w:right w:val="single" w:color="CCCCCC" w:sz="1"/>
+            </w:tcBorders>
+            <w:tcMar>
+              <w:top w:type="dxa" w:w="45"/>
+              <w:left w:type="dxa" w:w="70"/>
+              <w:bottom w:type="dxa" w:w="45"/>
+              <w:right w:type="dxa" w:w="70"/>
+            </w:tcMar>
+          </w:tcPr>
+          <w:p>
+            <w:r>
+              <w:rPr>
+                <w:rFonts w:ascii="Arial" w:cs="Arial" w:eastAsia="Arial" w:hAnsi="Arial"/>
+                <w:sz w:val="17"/>
+                <w:szCs w:val="17"/>
+              </w:rPr>
+              <w:t xml:space="preserve">분당 60회</w:t>
             </w:r>
           </w:p>
         </w:tc>
@@ -8570,6 +8500,255 @@
                 <w:sz w:val="17"/>
                 <w:szCs w:val="17"/>
               </w:rPr>
+              <w:t xml:space="preserve">보안 헤더</w:t>
+            </w:r>
+          </w:p>
+        </w:tc>
+        <w:tc>
+          <w:tcPr>
+            <w:tcW w:type="auto" w:w="0"/>
+            <w:tcBorders>
+              <w:top w:val="single" w:color="CCCCCC" w:sz="1"/>
+              <w:left w:val="single" w:color="CCCCCC" w:sz="1"/>
+              <w:bottom w:val="single" w:color="CCCCCC" w:sz="1"/>
+              <w:right w:val="single" w:color="CCCCCC" w:sz="1"/>
+            </w:tcBorders>
+            <w:tcMar>
+              <w:top w:type="dxa" w:w="45"/>
+              <w:left w:type="dxa" w:w="70"/>
+              <w:bottom w:type="dxa" w:w="45"/>
+              <w:right w:type="dxa" w:w="70"/>
+            </w:tcMar>
+          </w:tcPr>
+          <w:p>
+            <w:r>
+              <w:rPr>
+                <w:rFonts w:ascii="Arial" w:cs="Arial" w:eastAsia="Arial" w:hAnsi="Arial"/>
+                <w:sz w:val="17"/>
+                <w:szCs w:val="17"/>
+              </w:rPr>
+              <w:t xml:space="preserve">4종 자동</w:t>
+            </w:r>
+          </w:p>
+        </w:tc>
+        <w:tc>
+          <w:tcPr>
+            <w:tcW w:type="auto" w:w="0"/>
+            <w:tcBorders>
+              <w:top w:val="single" w:color="CCCCCC" w:sz="1"/>
+              <w:left w:val="single" w:color="CCCCCC" w:sz="1"/>
+              <w:bottom w:val="single" w:color="CCCCCC" w:sz="1"/>
+              <w:right w:val="single" w:color="CCCCCC" w:sz="1"/>
+            </w:tcBorders>
+            <w:tcMar>
+              <w:top w:type="dxa" w:w="45"/>
+              <w:left w:type="dxa" w:w="70"/>
+              <w:bottom w:type="dxa" w:w="45"/>
+              <w:right w:type="dxa" w:w="70"/>
+            </w:tcMar>
+          </w:tcPr>
+          <w:p>
+            <w:r>
+              <w:rPr>
+                <w:rFonts w:ascii="Arial" w:cs="Arial" w:eastAsia="Arial" w:hAnsi="Arial"/>
+                <w:sz w:val="17"/>
+                <w:szCs w:val="17"/>
+              </w:rPr>
+              <w:t xml:space="preserve">XSS, Clickjacking, HSTS, Referrer</w:t>
+            </w:r>
+          </w:p>
+        </w:tc>
+      </w:tr>
+      <w:tr>
+        <w:tc>
+          <w:tcPr>
+            <w:tcW w:type="auto" w:w="0"/>
+            <w:tcBorders>
+              <w:top w:val="single" w:color="CCCCCC" w:sz="1"/>
+              <w:left w:val="single" w:color="CCCCCC" w:sz="1"/>
+              <w:bottom w:val="single" w:color="CCCCCC" w:sz="1"/>
+              <w:right w:val="single" w:color="CCCCCC" w:sz="1"/>
+            </w:tcBorders>
+            <w:tcMar>
+              <w:top w:type="dxa" w:w="45"/>
+              <w:left w:type="dxa" w:w="70"/>
+              <w:bottom w:type="dxa" w:w="45"/>
+              <w:right w:type="dxa" w:w="70"/>
+            </w:tcMar>
+          </w:tcPr>
+          <w:p>
+            <w:r>
+              <w:rPr>
+                <w:rFonts w:ascii="Arial" w:cs="Arial" w:eastAsia="Arial" w:hAnsi="Arial"/>
+                <w:sz w:val="17"/>
+                <w:szCs w:val="17"/>
+              </w:rPr>
+              <w:t xml:space="preserve">입력 검증</w:t>
+            </w:r>
+          </w:p>
+        </w:tc>
+        <w:tc>
+          <w:tcPr>
+            <w:tcW w:type="auto" w:w="0"/>
+            <w:tcBorders>
+              <w:top w:val="single" w:color="CCCCCC" w:sz="1"/>
+              <w:left w:val="single" w:color="CCCCCC" w:sz="1"/>
+              <w:bottom w:val="single" w:color="CCCCCC" w:sz="1"/>
+              <w:right w:val="single" w:color="CCCCCC" w:sz="1"/>
+            </w:tcBorders>
+            <w:tcMar>
+              <w:top w:type="dxa" w:w="45"/>
+              <w:left w:type="dxa" w:w="70"/>
+              <w:bottom w:type="dxa" w:w="45"/>
+              <w:right w:type="dxa" w:w="70"/>
+            </w:tcMar>
+          </w:tcPr>
+          <w:p>
+            <w:r>
+              <w:rPr>
+                <w:rFonts w:ascii="Arial" w:cs="Arial" w:eastAsia="Arial" w:hAnsi="Arial"/>
+                <w:sz w:val="17"/>
+                <w:szCs w:val="17"/>
+              </w:rPr>
+              <w:t xml:space="preserve">정규식</w:t>
+            </w:r>
+          </w:p>
+        </w:tc>
+        <w:tc>
+          <w:tcPr>
+            <w:tcW w:type="auto" w:w="0"/>
+            <w:tcBorders>
+              <w:top w:val="single" w:color="CCCCCC" w:sz="1"/>
+              <w:left w:val="single" w:color="CCCCCC" w:sz="1"/>
+              <w:bottom w:val="single" w:color="CCCCCC" w:sz="1"/>
+              <w:right w:val="single" w:color="CCCCCC" w:sz="1"/>
+            </w:tcBorders>
+            <w:tcMar>
+              <w:top w:type="dxa" w:w="45"/>
+              <w:left w:type="dxa" w:w="70"/>
+              <w:bottom w:type="dxa" w:w="45"/>
+              <w:right w:type="dxa" w:w="70"/>
+            </w:tcMar>
+          </w:tcPr>
+          <w:p>
+            <w:r>
+              <w:rPr>
+                <w:rFonts w:ascii="Arial" w:cs="Arial" w:eastAsia="Arial" w:hAnsi="Arial"/>
+                <w:sz w:val="17"/>
+                <w:szCs w:val="17"/>
+              </w:rPr>
+              <w:t xml:space="preserve">user_id, 모델명, 파일 확장자</w:t>
+            </w:r>
+          </w:p>
+        </w:tc>
+      </w:tr>
+      <w:tr>
+        <w:tc>
+          <w:tcPr>
+            <w:tcW w:type="auto" w:w="0"/>
+            <w:tcBorders>
+              <w:top w:val="single" w:color="CCCCCC" w:sz="1"/>
+              <w:left w:val="single" w:color="CCCCCC" w:sz="1"/>
+              <w:bottom w:val="single" w:color="CCCCCC" w:sz="1"/>
+              <w:right w:val="single" w:color="CCCCCC" w:sz="1"/>
+            </w:tcBorders>
+            <w:tcMar>
+              <w:top w:type="dxa" w:w="45"/>
+              <w:left w:type="dxa" w:w="70"/>
+              <w:bottom w:type="dxa" w:w="45"/>
+              <w:right w:type="dxa" w:w="70"/>
+            </w:tcMar>
+          </w:tcPr>
+          <w:p>
+            <w:r>
+              <w:rPr>
+                <w:rFonts w:ascii="Arial" w:cs="Arial" w:eastAsia="Arial" w:hAnsi="Arial"/>
+                <w:sz w:val="17"/>
+                <w:szCs w:val="17"/>
+              </w:rPr>
+              <w:t xml:space="preserve">경로 보호</w:t>
+            </w:r>
+          </w:p>
+        </w:tc>
+        <w:tc>
+          <w:tcPr>
+            <w:tcW w:type="auto" w:w="0"/>
+            <w:tcBorders>
+              <w:top w:val="single" w:color="CCCCCC" w:sz="1"/>
+              <w:left w:val="single" w:color="CCCCCC" w:sz="1"/>
+              <w:bottom w:val="single" w:color="CCCCCC" w:sz="1"/>
+              <w:right w:val="single" w:color="CCCCCC" w:sz="1"/>
+            </w:tcBorders>
+            <w:tcMar>
+              <w:top w:type="dxa" w:w="45"/>
+              <w:left w:type="dxa" w:w="70"/>
+              <w:bottom w:type="dxa" w:w="45"/>
+              <w:right w:type="dxa" w:w="70"/>
+            </w:tcMar>
+          </w:tcPr>
+          <w:p>
+            <w:r>
+              <w:rPr>
+                <w:rFonts w:ascii="Arial" w:cs="Arial" w:eastAsia="Arial" w:hAnsi="Arial"/>
+                <w:sz w:val="17"/>
+                <w:szCs w:val="17"/>
+              </w:rPr>
+              <w:t xml:space="preserve">PUBLIC_PATHS</w:t>
+            </w:r>
+          </w:p>
+        </w:tc>
+        <w:tc>
+          <w:tcPr>
+            <w:tcW w:type="auto" w:w="0"/>
+            <w:tcBorders>
+              <w:top w:val="single" w:color="CCCCCC" w:sz="1"/>
+              <w:left w:val="single" w:color="CCCCCC" w:sz="1"/>
+              <w:bottom w:val="single" w:color="CCCCCC" w:sz="1"/>
+              <w:right w:val="single" w:color="CCCCCC" w:sz="1"/>
+            </w:tcBorders>
+            <w:tcMar>
+              <w:top w:type="dxa" w:w="45"/>
+              <w:left w:type="dxa" w:w="70"/>
+              <w:bottom w:type="dxa" w:w="45"/>
+              <w:right w:type="dxa" w:w="70"/>
+            </w:tcMar>
+          </w:tcPr>
+          <w:p>
+            <w:r>
+              <w:rPr>
+                <w:rFonts w:ascii="Arial" w:cs="Arial" w:eastAsia="Arial" w:hAnsi="Arial"/>
+                <w:sz w:val="17"/>
+                <w:szCs w:val="17"/>
+              </w:rPr>
+              <w:t xml:space="preserve">관리 API 인증 필요</w:t>
+            </w:r>
+          </w:p>
+        </w:tc>
+      </w:tr>
+      <w:tr>
+        <w:tc>
+          <w:tcPr>
+            <w:tcW w:type="auto" w:w="0"/>
+            <w:tcBorders>
+              <w:top w:val="single" w:color="CCCCCC" w:sz="1"/>
+              <w:left w:val="single" w:color="CCCCCC" w:sz="1"/>
+              <w:bottom w:val="single" w:color="CCCCCC" w:sz="1"/>
+              <w:right w:val="single" w:color="CCCCCC" w:sz="1"/>
+            </w:tcBorders>
+            <w:tcMar>
+              <w:top w:type="dxa" w:w="45"/>
+              <w:left w:type="dxa" w:w="70"/>
+              <w:bottom w:type="dxa" w:w="45"/>
+              <w:right w:type="dxa" w:w="70"/>
+            </w:tcMar>
+          </w:tcPr>
+          <w:p>
+            <w:r>
+              <w:rPr>
+                <w:rFonts w:ascii="Arial" w:cs="Arial" w:eastAsia="Arial" w:hAnsi="Arial"/>
+                <w:sz w:val="17"/>
+                <w:szCs w:val="17"/>
+              </w:rPr>
               <w:t xml:space="preserve">데이터 검증</w:t>
             </w:r>
           </w:p>
@@ -8625,6 +8804,89 @@
                 <w:szCs w:val="17"/>
               </w:rPr>
               <w:t xml:space="preserve">WebSocket 게이지 화이트리스트</w:t>
+            </w:r>
+          </w:p>
+        </w:tc>
+      </w:tr>
+      <w:tr>
+        <w:tc>
+          <w:tcPr>
+            <w:tcW w:type="auto" w:w="0"/>
+            <w:tcBorders>
+              <w:top w:val="single" w:color="CCCCCC" w:sz="1"/>
+              <w:left w:val="single" w:color="CCCCCC" w:sz="1"/>
+              <w:bottom w:val="single" w:color="CCCCCC" w:sz="1"/>
+              <w:right w:val="single" w:color="CCCCCC" w:sz="1"/>
+            </w:tcBorders>
+            <w:tcMar>
+              <w:top w:type="dxa" w:w="45"/>
+              <w:left w:type="dxa" w:w="70"/>
+              <w:bottom w:type="dxa" w:w="45"/>
+              <w:right w:type="dxa" w:w="70"/>
+            </w:tcMar>
+          </w:tcPr>
+          <w:p>
+            <w:r>
+              <w:rPr>
+                <w:rFonts w:ascii="Arial" w:cs="Arial" w:eastAsia="Arial" w:hAnsi="Arial"/>
+                <w:sz w:val="17"/>
+                <w:szCs w:val="17"/>
+              </w:rPr>
+              <w:t xml:space="preserve">.env 보호</w:t>
+            </w:r>
+          </w:p>
+        </w:tc>
+        <w:tc>
+          <w:tcPr>
+            <w:tcW w:type="auto" w:w="0"/>
+            <w:tcBorders>
+              <w:top w:val="single" w:color="CCCCCC" w:sz="1"/>
+              <w:left w:val="single" w:color="CCCCCC" w:sz="1"/>
+              <w:bottom w:val="single" w:color="CCCCCC" w:sz="1"/>
+              <w:right w:val="single" w:color="CCCCCC" w:sz="1"/>
+            </w:tcBorders>
+            <w:tcMar>
+              <w:top w:type="dxa" w:w="45"/>
+              <w:left w:type="dxa" w:w="70"/>
+              <w:bottom w:type="dxa" w:w="45"/>
+              <w:right w:type="dxa" w:w="70"/>
+            </w:tcMar>
+          </w:tcPr>
+          <w:p>
+            <w:r>
+              <w:rPr>
+                <w:rFonts w:ascii="Arial" w:cs="Arial" w:eastAsia="Arial" w:hAnsi="Arial"/>
+                <w:sz w:val="17"/>
+                <w:szCs w:val="17"/>
+              </w:rPr>
+              <w:t xml:space="preserve">.gitignore</w:t>
+            </w:r>
+          </w:p>
+        </w:tc>
+        <w:tc>
+          <w:tcPr>
+            <w:tcW w:type="auto" w:w="0"/>
+            <w:tcBorders>
+              <w:top w:val="single" w:color="CCCCCC" w:sz="1"/>
+              <w:left w:val="single" w:color="CCCCCC" w:sz="1"/>
+              <w:bottom w:val="single" w:color="CCCCCC" w:sz="1"/>
+              <w:right w:val="single" w:color="CCCCCC" w:sz="1"/>
+            </w:tcBorders>
+            <w:tcMar>
+              <w:top w:type="dxa" w:w="45"/>
+              <w:left w:type="dxa" w:w="70"/>
+              <w:bottom w:type="dxa" w:w="45"/>
+              <w:right w:type="dxa" w:w="70"/>
+            </w:tcMar>
+          </w:tcPr>
+          <w:p>
+            <w:r>
+              <w:rPr>
+                <w:rFonts w:ascii="Arial" w:cs="Arial" w:eastAsia="Arial" w:hAnsi="Arial"/>
+                <w:sz w:val="17"/>
+                <w:szCs w:val="17"/>
+              </w:rPr>
+              <w:t xml:space="preserve">git 히스토리에 없음 확인, .env.example 제공</w:t>
             </w:r>
           </w:p>
         </w:tc>
@@ -12717,7 +12979,7 @@
           <w:sz w:val="22"/>
           <w:szCs w:val="22"/>
         </w:rPr>
-        <w:t xml:space="preserve">18.1 신규 기능 5건</w:t>
+        <w:t xml:space="preserve">18.1 신규 기능</w:t>
       </w:r>
     </w:p>
     <w:p>
@@ -12759,7 +13021,7 @@
           <w:sz w:val="17"/>
           <w:szCs w:val="17"/>
         </w:rPr>
-        <w:t xml:space="preserve">- 라이트 모드 전역 전환 (Samsung Blue #1a73e8)</w:t>
+        <w:t xml:space="preserve">- 상단 네비게이션(TopNav) 전환 - 사이드바 제거</w:t>
       </w:r>
     </w:p>
     <w:p>
@@ -12773,7 +13035,91 @@
           <w:sz w:val="17"/>
           <w:szCs w:val="17"/>
         </w:rPr>
+        <w:t xml:space="preserve">- 라이트 모드 전역 전환 (Samsung Blue + Tailwind 테마)</w:t>
+      </w:r>
+    </w:p>
+    <w:p>
+      <w:pPr>
+        <w:spacing w:after="50"/>
+        <w:ind w:left="360"/>
+      </w:pPr>
+      <w:r>
+        <w:rPr>
+          <w:rFonts w:ascii="Arial" w:cs="Arial" w:eastAsia="Arial" w:hAnsi="Arial"/>
+          <w:sz w:val="17"/>
+          <w:szCs w:val="17"/>
+        </w:rPr>
         <w:t xml:space="preserve">- 걸어다니는 아바타 캐릭터 애니메이션</w:t>
+      </w:r>
+    </w:p>
+    <w:p>
+      <w:pPr>
+        <w:spacing w:after="50"/>
+        <w:ind w:left="360"/>
+      </w:pPr>
+      <w:r>
+        <w:rPr>
+          <w:rFonts w:ascii="Arial" w:cs="Arial" w:eastAsia="Arial" w:hAnsi="Arial"/>
+          <w:sz w:val="17"/>
+          <w:szCs w:val="17"/>
+        </w:rPr>
+        <w:t xml:space="preserve">- 로드맵 -&gt; 시뮬레이터 내 탭으로 통합 (13페이지)</w:t>
+      </w:r>
+    </w:p>
+    <w:p>
+      <w:pPr>
+        <w:spacing w:after="50"/>
+        <w:ind w:left="360"/>
+      </w:pPr>
+      <w:r>
+        <w:rPr>
+          <w:rFonts w:ascii="Arial" w:cs="Arial" w:eastAsia="Arial" w:hAnsi="Arial"/>
+          <w:sz w:val="17"/>
+          <w:szCs w:val="17"/>
+        </w:rPr>
+        <w:t xml:space="preserve">- 모니터링 에이전트 시스템 (코어+4서포트+CLAUDE.md 연계)</w:t>
+      </w:r>
+    </w:p>
+    <w:p>
+      <w:pPr>
+        <w:spacing w:after="50"/>
+        <w:ind w:left="360"/>
+      </w:pPr>
+      <w:r>
+        <w:rPr>
+          <w:rFonts w:ascii="Arial" w:cs="Arial" w:eastAsia="Arial" w:hAnsi="Arial"/>
+          <w:sz w:val="17"/>
+          <w:szCs w:val="17"/>
+        </w:rPr>
+        <w:t xml:space="preserve">- SVG 게이지 (Recharts 제거) + WCAG AA 텍스트 대비</w:t>
+      </w:r>
+    </w:p>
+    <w:p>
+      <w:pPr>
+        <w:spacing w:after="50"/>
+        <w:ind w:left="360"/>
+      </w:pPr>
+      <w:r>
+        <w:rPr>
+          <w:rFonts w:ascii="Arial" w:cs="Arial" w:eastAsia="Arial" w:hAnsi="Arial"/>
+          <w:sz w:val="17"/>
+          <w:szCs w:val="17"/>
+        </w:rPr>
+        <w:t xml:space="preserve">- 로그인 보안 강화 (Authorization 헤더, sessionStorage, 게스트 제한)</w:t>
+      </w:r>
+    </w:p>
+    <w:p>
+      <w:pPr>
+        <w:spacing w:after="50"/>
+        <w:ind w:left="360"/>
+      </w:pPr>
+      <w:r>
+        <w:rPr>
+          <w:rFonts w:ascii="Arial" w:cs="Arial" w:eastAsia="Arial" w:hAnsi="Arial"/>
+          <w:sz w:val="17"/>
+          <w:szCs w:val="17"/>
+        </w:rPr>
+        <w:t xml:space="preserve">- Unsplash 공용 이미지 랜딩 페이지</w:t>
       </w:r>
     </w:p>
     <w:p>

</xml_diff>